<commit_message>
admin: separar permisos admin/superadmin y agregar panel de ingresos
- PATCH /admin/shop/{id} ahora requiere superadmin (editar precios afecta ingresos)
- Nuevo GET /admin/revenue (superadmin): total cobrado + historial de compras
- Frontend: pestaña 'Ingresos' solo visible para superadmin; tienda deshabilitada para admin normal
</commit_message>
<xml_diff>
--- a/TESIS - SINKA.docx
+++ b/TESIS - SINKA.docx
@@ -4176,19 +4176,33 @@
         </w:numPr>
         <w:ind w:left="284" w:hanging="284"/>
       </w:pPr>
-      <w:bookmarkStart w:id="7" w:name="_Toc239281101"/>
       <w:r>
         <w:lastRenderedPageBreak/>
         <w:t>Resumen</w:t>
       </w:r>
-      <w:bookmarkEnd w:id="7"/>
     </w:p>
     <w:p>
       <w:pPr>
         <w:pStyle w:val="Texto"/>
       </w:pPr>
       <w:r>
-        <w:t>La gestión del tiempo se ha convertido en uno de los principales retos para quienes estudian o trabajan frente a una pantalla. Las cifras internacionales muestran que la mayoría de estudiantes universitarios procrastina con frecuencia y que muy pocos cuentan con un sistema formal para organizar sus actividades. En Ecuador este fenómeno se relaciona de forma directa con el estrés académico y el bajo rendimiento, mientras que en la ciudad de Loja la investigación local sobre el tema es todavía escasa. Esa realidad motivó el presente proyecto titulado “Desarrollo de una plataforma web de concentración colaborativa online con emparejamiento aleatorio para mejorar la productividad en las actividades digitales en la ciudad de Loja”.</w:t>
+        <w:t xml:space="preserve">La gestión del tiempo se ha convertido en uno de los principales desafíos para quienes estudian o trabajan frente a una pantalla. Investigaciones internacionales muestran que la mayoría de estudiantes universitarios procrastina frecuentemente y muy pocos tienen un sistema formal para organizar sus actividades (Garzón </w:t>
+      </w:r>
+      <w:proofErr w:type="spellStart"/>
+      <w:r>
+        <w:t>Umerenkova</w:t>
+      </w:r>
+      <w:proofErr w:type="spellEnd"/>
+      <w:r>
+        <w:t xml:space="preserve"> &amp; Gil Flores, 2017; </w:t>
+      </w:r>
+      <w:proofErr w:type="spellStart"/>
+      <w:r>
+        <w:t>Svartdal</w:t>
+      </w:r>
+      <w:proofErr w:type="spellEnd"/>
+      <w:r>
+        <w:t xml:space="preserve"> et al., 2018). En Ecuador este problema está directamente relacionado con el estrés académico y el bajo rendimiento, mientras que en la ciudad de Loja aún hay poca investigación sobre plataformas de concentración colaborativa y procrastinación digital. Esto motivó el desarrollo de un proyecto titulado "Desarrollo de una plataforma web de concentración colaborativa online con emparejamiento aleatorio para mejorar la productividad en las actividades digitales en la ciudad de Loja".</w:t>
       </w:r>
     </w:p>
     <w:p>
@@ -4196,7 +4210,10 @@
         <w:pStyle w:val="Texto"/>
       </w:pPr>
       <w:r>
-        <w:t xml:space="preserve">El objetivo general consistió en desarrollar una plataforma web de concentración colaborativa con emparejamiento aleatorio que integre herramientas digitales orientadas a la gestión del tiempo. Para cumplirlo se revisó literatura científica sobre procrastinación y productividad digital, se aplicó una encuesta a personas que realizan actividades digitales en la ciudad y se construyó el software siguiendo una metodología híbrida que combina SCRUM con las prácticas técnicas de Extreme </w:t>
+        <w:t xml:space="preserve">El objetivo principal fue desarrollar una plataforma web de concentración colaborativa con emparejamiento aleatorio que incluya herramientas digitales para gestionar el tiempo. </w:t>
+      </w:r>
+      <w:r>
+        <w:t xml:space="preserve">Para lograrlo, revisamos la literatura científica sobre procrastinación y productividad, realizamos una encuesta con personas que trabajan en actividades digitales en la ciudad, y construimos el software usando una metodología híbrida que combina SCRUM con prácticas de Extreme </w:t>
       </w:r>
       <w:proofErr w:type="spellStart"/>
       <w:r>
@@ -4204,7 +4221,7 @@
       </w:r>
       <w:proofErr w:type="spellEnd"/>
       <w:r>
-        <w:t xml:space="preserve"> organizadas en tres fases: Pre-Juego, Juego y Post-Juego.</w:t>
+        <w:t xml:space="preserve"> en tres fases: Pre-Juego, Juego y Post-Juego.</w:t>
       </w:r>
     </w:p>
     <w:p>
@@ -4212,7 +4229,10 @@
         <w:pStyle w:val="Texto"/>
       </w:pPr>
       <w:r>
-        <w:t xml:space="preserve">Como propuesta de acción se desarrolló SINKA, una plataforma que conecta de manera aleatoria a dos personas que desean concentrarse al mismo tiempo. Ambas comparten un temporizador </w:t>
+        <w:t xml:space="preserve">La solución desarrollada fue SINKA, una plataforma que conecta aleatoriamente a dos personas que quieren concentrarse al mismo tiempo. </w:t>
+      </w:r>
+      <w:r>
+        <w:t xml:space="preserve">Ambas comparten un temporizador </w:t>
       </w:r>
       <w:proofErr w:type="spellStart"/>
       <w:r>
@@ -4220,16 +4240,37 @@
       </w:r>
       <w:proofErr w:type="spellEnd"/>
       <w:r>
-        <w:t xml:space="preserve"> sincronizado, pueden verse por cámara durante la sesión y conversar en los descansos. El sistema premia la constancia con puntos de experiencia, monedas virtuales y rachas diarias que se reflejan en un ranking global. El producto quedó desplegado en producción con seis </w:t>
+        <w:t xml:space="preserve"> sincronizado, pueden verse por cámara durante las sesiones de trabajo y pueden conversar en los descansos. El sistema premia la constancia con puntos de experiencia, monedas virtuales y rachas diarias que se muestran en un ranking global. </w:t>
+      </w:r>
+    </w:p>
+    <w:p>
+      <w:pPr>
+        <w:pStyle w:val="Texto"/>
+      </w:pPr>
+    </w:p>
+    <w:p>
+      <w:pPr>
+        <w:pStyle w:val="Texto"/>
+      </w:pPr>
+      <w:r>
+        <w:lastRenderedPageBreak/>
+        <w:t xml:space="preserve">Palabras Clave: Procrastinación, Concentración, Productividad, Emparejamiento, </w:t>
       </w:r>
       <w:proofErr w:type="spellStart"/>
       <w:r>
-        <w:t>sprints</w:t>
+        <w:t>Pomodoro</w:t>
       </w:r>
       <w:proofErr w:type="spellEnd"/>
-      <w:r>
-        <w:t xml:space="preserve"> completados y una cobertura de pruebas superior al ochenta por ciento en la capa de servicios.</w:t>
-      </w:r>
+    </w:p>
+    <w:p>
+      <w:pPr>
+        <w:pStyle w:val="Texto"/>
+      </w:pPr>
+    </w:p>
+    <w:p>
+      <w:pPr>
+        <w:pStyle w:val="Texto"/>
+      </w:pPr>
     </w:p>
     <w:p>
       <w:pPr>
@@ -4241,13 +4282,13 @@
         </w:numPr>
         <w:ind w:left="284" w:hanging="284"/>
       </w:pPr>
-      <w:bookmarkStart w:id="8" w:name="_Toc239281102"/>
+      <w:bookmarkStart w:id="7" w:name="_Toc239281102"/>
       <w:proofErr w:type="spellStart"/>
       <w:r>
         <w:lastRenderedPageBreak/>
         <w:t>Abstract</w:t>
       </w:r>
-      <w:bookmarkEnd w:id="8"/>
+      <w:bookmarkEnd w:id="7"/>
       <w:proofErr w:type="spellEnd"/>
     </w:p>
     <w:p>
@@ -4261,7 +4302,35 @@
         <w:rPr>
           <w:lang w:val="en-US"/>
         </w:rPr>
-        <w:t>Time management has become one of the main challenges for people who study or work in front of a screen. International figures show that most university students procrastinate frequently and very few have a formal system to organize their activities. In Ecuador this phenomenon is directly related to academic stress and low performance, while local research on the subject is still scarce in the city of Loja. That reality motivated this project entitled “Development of an online collaborative focus web platform with random matching to improve productivity in digital activities in the city of Loja”.</w:t>
+        <w:t xml:space="preserve">Time management has become one of the main challenges for those who study or work in front of a screen. International research shows that most university students procrastinate frequently and that very few have a formal system to organize their activities (Garzón </w:t>
+      </w:r>
+      <w:proofErr w:type="spellStart"/>
+      <w:r>
+        <w:rPr>
+          <w:lang w:val="en-US"/>
+        </w:rPr>
+        <w:t>Umerenkova</w:t>
+      </w:r>
+      <w:proofErr w:type="spellEnd"/>
+      <w:r>
+        <w:rPr>
+          <w:lang w:val="en-US"/>
+        </w:rPr>
+        <w:t xml:space="preserve"> &amp; Gil Flores, 2017; </w:t>
+      </w:r>
+      <w:proofErr w:type="spellStart"/>
+      <w:r>
+        <w:rPr>
+          <w:lang w:val="en-US"/>
+        </w:rPr>
+        <w:t>Svartdal</w:t>
+      </w:r>
+      <w:proofErr w:type="spellEnd"/>
+      <w:r>
+        <w:rPr>
+          <w:lang w:val="en-US"/>
+        </w:rPr>
+        <w:t xml:space="preserve"> et al., 2018). In Ecuador, this phenomenon is directly related to academic stress and poor performance, while in the city of Loja, there is limited local research on collaborative focus platforms and digital procrastination. This motivated the development of a web platform titled "Development of a web platform for online collaborative focus with random pairing to improve productivity in digital activities in the city of Loja."</w:t>
       </w:r>
     </w:p>
     <w:p>
@@ -4271,11 +4340,19 @@
           <w:lang w:val="en-US"/>
         </w:rPr>
       </w:pPr>
-      <w:r>
+    </w:p>
+    <w:p>
+      <w:pPr>
+        <w:pStyle w:val="Texto"/>
         <w:rPr>
           <w:lang w:val="en-US"/>
         </w:rPr>
-        <w:t>The general objective was to develop a collaborative focus web platform with random matching that integrates digital tools oriented to time management. To achieve it, scientific literature on procrastination and digital productivity was reviewed, a survey was applied to people who perform digital activities in the city and the software was built following a hybrid methodology that combines SCRUM with the technical practices of Extreme Programming organized in three phases: Pre-Game, Game and Post-Game.</w:t>
+      </w:pPr>
+      <w:r>
+        <w:rPr>
+          <w:lang w:val="en-US"/>
+        </w:rPr>
+        <w:t>The main goal was to develop a web platform for collaborative focus with random pairing that includes digital tools for time management. To do this, we reviewed scientific literature on procrastination and productivity, conducted a survey with people who do digital work in the city, and built the software using a hybrid approach that combines SCRUM with Extreme Programming practices in three phases: Pre-Game, Game, and Post-Game.</w:t>
       </w:r>
     </w:p>
     <w:p>
@@ -4285,20 +4362,20 @@
           <w:lang w:val="en-US"/>
         </w:rPr>
       </w:pPr>
-      <w:r>
+    </w:p>
+    <w:p>
+      <w:pPr>
+        <w:pStyle w:val="Texto"/>
         <w:rPr>
           <w:lang w:val="en-US"/>
         </w:rPr>
-        <w:t>As a proposal for action SINKA was developed, a platform that randomly connects two people who want to focus at the same time. Both share a synchronized Pomodoro timer, can see each other on camera during the session and talk during breaks. The system rewards consistency with experience points, virtual coins and daily streaks reflected in a global ranking. The product was deployed to production with six completed sprints and test coverage above eighty percent in the service layer.</w:t>
-      </w:r>
-    </w:p>
-    <w:p>
-      <w:pPr>
-        <w:pStyle w:val="Texto"/>
+      </w:pPr>
+      <w:r>
         <w:rPr>
           <w:lang w:val="en-US"/>
         </w:rPr>
-      </w:pPr>
+        <w:t>The solution developed was SINKA, a platform that connects two people randomly who want to focus at the same time. Both share a synchronized Pomodoro timer, can see each other on camera during work sessions, and can chat during breaks. The system rewards consistency with experience points, virtual coins, and daily streaks shown in a global ranking.</w:t>
+      </w:r>
     </w:p>
     <w:p>
       <w:pPr>
@@ -4310,7 +4387,7 @@
         </w:numPr>
         <w:ind w:left="284" w:hanging="284"/>
       </w:pPr>
-      <w:bookmarkStart w:id="9" w:name="_Toc239281103"/>
+      <w:bookmarkStart w:id="8" w:name="_Toc239281103"/>
       <w:r>
         <w:lastRenderedPageBreak/>
         <w:t>Prob</w:t>
@@ -4321,7 +4398,7 @@
       <w:r>
         <w:t>mática</w:t>
       </w:r>
-      <w:bookmarkEnd w:id="9"/>
+      <w:bookmarkEnd w:id="8"/>
     </w:p>
     <w:p>
       <w:pPr>
@@ -4471,7 +4548,7 @@
         <w:lastRenderedPageBreak/>
         <w:br w:type="page"/>
       </w:r>
-      <w:bookmarkStart w:id="10" w:name="_Toc239281104"/>
+      <w:bookmarkStart w:id="9" w:name="_Toc239281104"/>
       <w:r>
         <w:lastRenderedPageBreak/>
         <w:t>T</w:t>
@@ -4479,7 +4556,7 @@
       <w:r>
         <w:t>ema</w:t>
       </w:r>
-      <w:bookmarkEnd w:id="10"/>
+      <w:bookmarkEnd w:id="9"/>
     </w:p>
     <w:p>
       <w:pPr>
@@ -4509,7 +4586,7 @@
           <w:numId w:val="18"/>
         </w:numPr>
       </w:pPr>
-      <w:bookmarkStart w:id="11" w:name="_Toc239281105"/>
+      <w:bookmarkStart w:id="10" w:name="_Toc239281105"/>
       <w:r>
         <w:lastRenderedPageBreak/>
         <w:t>L</w:t>
@@ -4523,53 +4600,53 @@
       <w:r>
         <w:t>mientos de Investigación</w:t>
       </w:r>
+      <w:bookmarkEnd w:id="10"/>
+    </w:p>
+    <w:p>
+      <w:pPr>
+        <w:pStyle w:val="Ttulo2"/>
+      </w:pPr>
+      <w:bookmarkStart w:id="11" w:name="_Toc215487486"/>
+      <w:bookmarkStart w:id="12" w:name="_Toc239281106"/>
+      <w:r>
+        <w:t>5</w:t>
+      </w:r>
+      <w:r>
+        <w:t>.1. Línea y Sublínea de Investigación</w:t>
+      </w:r>
       <w:bookmarkEnd w:id="11"/>
+      <w:bookmarkEnd w:id="12"/>
+    </w:p>
+    <w:p>
+      <w:pPr>
+        <w:pStyle w:val="Texto"/>
+      </w:pPr>
+      <w:r>
+        <w:t>Línea 1 Desarrollo tecnológico, internet de las cosas, big data e innovación en procesos de automatización y sistematización organizacional.</w:t>
+      </w:r>
+    </w:p>
+    <w:p>
+      <w:pPr>
+        <w:pStyle w:val="Texto"/>
+      </w:pPr>
+      <w:r>
+        <w:t>Sublínea: Capacidad tecnológica y productividad en empresas.</w:t>
+      </w:r>
     </w:p>
     <w:p>
       <w:pPr>
         <w:pStyle w:val="Ttulo2"/>
       </w:pPr>
-      <w:bookmarkStart w:id="12" w:name="_Toc215487486"/>
-      <w:bookmarkStart w:id="13" w:name="_Toc239281106"/>
+      <w:bookmarkStart w:id="13" w:name="_Toc215487487"/>
+      <w:bookmarkStart w:id="14" w:name="_Toc239281107"/>
       <w:r>
         <w:t>5</w:t>
       </w:r>
       <w:r>
-        <w:t>.1. Línea y Sublínea de Investigación</w:t>
-      </w:r>
-      <w:bookmarkEnd w:id="12"/>
+        <w:t>.2. ODS</w:t>
+      </w:r>
       <w:bookmarkEnd w:id="13"/>
-    </w:p>
-    <w:p>
-      <w:pPr>
-        <w:pStyle w:val="Texto"/>
-      </w:pPr>
-      <w:r>
-        <w:t>Línea 1 Desarrollo tecnológico, internet de las cosas, big data e innovación en procesos de automatización y sistematización organizacional.</w:t>
-      </w:r>
-    </w:p>
-    <w:p>
-      <w:pPr>
-        <w:pStyle w:val="Texto"/>
-      </w:pPr>
-      <w:r>
-        <w:t>Sublínea: Capacidad tecnológica y productividad en empresas.</w:t>
-      </w:r>
-    </w:p>
-    <w:p>
-      <w:pPr>
-        <w:pStyle w:val="Ttulo2"/>
-      </w:pPr>
-      <w:bookmarkStart w:id="14" w:name="_Toc215487487"/>
-      <w:bookmarkStart w:id="15" w:name="_Toc239281107"/>
-      <w:r>
-        <w:t>5</w:t>
-      </w:r>
-      <w:r>
-        <w:t>.2. ODS</w:t>
-      </w:r>
       <w:bookmarkEnd w:id="14"/>
-      <w:bookmarkEnd w:id="15"/>
     </w:p>
     <w:p>
       <w:pPr>
@@ -4611,16 +4688,16 @@
       <w:pPr>
         <w:pStyle w:val="Ttulo2"/>
       </w:pPr>
-      <w:bookmarkStart w:id="16" w:name="_Toc215487488"/>
-      <w:bookmarkStart w:id="17" w:name="_Toc239281108"/>
+      <w:bookmarkStart w:id="15" w:name="_Toc215487488"/>
+      <w:bookmarkStart w:id="16" w:name="_Toc239281108"/>
       <w:r>
         <w:t>5</w:t>
       </w:r>
       <w:r>
         <w:t>.3. Programa de Investigación</w:t>
       </w:r>
+      <w:bookmarkEnd w:id="15"/>
       <w:bookmarkEnd w:id="16"/>
-      <w:bookmarkEnd w:id="17"/>
     </w:p>
     <w:p>
       <w:pPr>
@@ -4679,7 +4756,7 @@
         </w:numPr>
         <w:ind w:left="284" w:hanging="284"/>
       </w:pPr>
-      <w:bookmarkStart w:id="18" w:name="_Toc239281109"/>
+      <w:bookmarkStart w:id="17" w:name="_Toc239281109"/>
       <w:r>
         <w:lastRenderedPageBreak/>
         <w:t>J</w:t>
@@ -4687,7 +4764,7 @@
       <w:r>
         <w:t>ustificación</w:t>
       </w:r>
-      <w:bookmarkEnd w:id="18"/>
+      <w:bookmarkEnd w:id="17"/>
     </w:p>
     <w:p>
       <w:pPr>
@@ -4813,7 +4890,7 @@
         </w:numPr>
         <w:ind w:left="284" w:hanging="284"/>
       </w:pPr>
-      <w:bookmarkStart w:id="19" w:name="_Toc239281110"/>
+      <w:bookmarkStart w:id="18" w:name="_Toc239281110"/>
       <w:r>
         <w:lastRenderedPageBreak/>
         <w:t>O</w:t>
@@ -4827,7 +4904,7 @@
       <w:r>
         <w:t>tivos</w:t>
       </w:r>
-      <w:bookmarkEnd w:id="19"/>
+      <w:bookmarkEnd w:id="18"/>
     </w:p>
     <w:p>
       <w:pPr>
@@ -4837,13 +4914,13 @@
           <w:numId w:val="26"/>
         </w:numPr>
       </w:pPr>
-      <w:bookmarkStart w:id="20" w:name="_Toc215487491"/>
-      <w:bookmarkStart w:id="21" w:name="_Toc239281111"/>
+      <w:bookmarkStart w:id="19" w:name="_Toc215487491"/>
+      <w:bookmarkStart w:id="20" w:name="_Toc239281111"/>
       <w:r>
         <w:t>Objetivo General</w:t>
       </w:r>
+      <w:bookmarkEnd w:id="19"/>
       <w:bookmarkEnd w:id="20"/>
-      <w:bookmarkEnd w:id="21"/>
       <w:r>
         <w:t xml:space="preserve"> </w:t>
       </w:r>
@@ -4883,16 +4960,16 @@
         </w:rPr>
         <w:t xml:space="preserve"> </w:t>
       </w:r>
-      <w:bookmarkStart w:id="22" w:name="_Toc215487492"/>
-      <w:bookmarkStart w:id="23" w:name="_Toc239281112"/>
+      <w:bookmarkStart w:id="21" w:name="_Toc215487492"/>
+      <w:bookmarkStart w:id="22" w:name="_Toc239281112"/>
       <w:r>
         <w:rPr>
           <w:rFonts w:cs="Times New Roman"/>
         </w:rPr>
         <w:t>Objetivos Específicos</w:t>
       </w:r>
+      <w:bookmarkEnd w:id="21"/>
       <w:bookmarkEnd w:id="22"/>
-      <w:bookmarkEnd w:id="23"/>
       <w:r>
         <w:rPr>
           <w:rFonts w:cs="Times New Roman"/>
@@ -4963,7 +5040,7 @@
         </w:numPr>
         <w:ind w:left="284" w:hanging="284"/>
       </w:pPr>
-      <w:bookmarkStart w:id="24" w:name="_Toc239281113"/>
+      <w:bookmarkStart w:id="23" w:name="_Toc239281113"/>
       <w:r>
         <w:lastRenderedPageBreak/>
         <w:t xml:space="preserve">Marco </w:t>
@@ -4974,7 +5051,7 @@
       <w:r>
         <w:t>eórico</w:t>
       </w:r>
-      <w:bookmarkEnd w:id="24"/>
+      <w:bookmarkEnd w:id="23"/>
     </w:p>
     <w:p>
       <w:pPr>
@@ -4984,13 +5061,13 @@
           <w:numId w:val="23"/>
         </w:numPr>
       </w:pPr>
-      <w:bookmarkStart w:id="25" w:name="_Toc215487494"/>
-      <w:bookmarkStart w:id="26" w:name="_Toc239281114"/>
+      <w:bookmarkStart w:id="24" w:name="_Toc215487494"/>
+      <w:bookmarkStart w:id="25" w:name="_Toc239281114"/>
       <w:r>
         <w:t>Marco Contextual</w:t>
       </w:r>
+      <w:bookmarkEnd w:id="24"/>
       <w:bookmarkEnd w:id="25"/>
-      <w:bookmarkEnd w:id="26"/>
     </w:p>
     <w:p>
       <w:pPr>
@@ -5114,7 +5191,7 @@
           <w:szCs w:val="20"/>
         </w:rPr>
       </w:pPr>
-      <w:bookmarkStart w:id="27" w:name="_Toc215487505"/>
+      <w:bookmarkStart w:id="26" w:name="_Toc215487505"/>
       <w:r>
         <w:rPr>
           <w:rFonts w:ascii="Times New Roman" w:hAnsi="Times New Roman" w:cs="Times New Roman"/>
@@ -5216,7 +5293,7 @@
         </w:rPr>
         <w:t>Mapa del Ecuador.</w:t>
       </w:r>
-      <w:bookmarkEnd w:id="27"/>
+      <w:bookmarkEnd w:id="26"/>
     </w:p>
     <w:p>
       <w:pPr>
@@ -5304,16 +5381,16 @@
         <w:pStyle w:val="Ttulo2"/>
         <w:ind w:left="720"/>
       </w:pPr>
-      <w:bookmarkStart w:id="28" w:name="_Toc239281115"/>
+      <w:bookmarkStart w:id="27" w:name="_Toc239281115"/>
       <w:r>
         <w:t xml:space="preserve">8.2 </w:t>
       </w:r>
-      <w:bookmarkStart w:id="29" w:name="_Toc215487495"/>
+      <w:bookmarkStart w:id="28" w:name="_Toc215487495"/>
       <w:r>
         <w:t>Marco Conceptual</w:t>
       </w:r>
+      <w:bookmarkEnd w:id="27"/>
       <w:bookmarkEnd w:id="28"/>
-      <w:bookmarkEnd w:id="29"/>
     </w:p>
     <w:p>
       <w:pPr>
@@ -5673,7 +5750,7 @@
           <w:numId w:val="23"/>
         </w:numPr>
       </w:pPr>
-      <w:bookmarkStart w:id="30" w:name="_Toc239281116"/>
+      <w:bookmarkStart w:id="29" w:name="_Toc239281116"/>
       <w:r>
         <w:lastRenderedPageBreak/>
         <w:t xml:space="preserve">Diseño </w:t>
@@ -5684,7 +5761,7 @@
       <w:r>
         <w:t>ógico</w:t>
       </w:r>
-      <w:bookmarkEnd w:id="30"/>
+      <w:bookmarkEnd w:id="29"/>
     </w:p>
     <w:p>
       <w:pPr>
@@ -5697,11 +5774,11 @@
       <w:r>
         <w:t xml:space="preserve"> </w:t>
       </w:r>
-      <w:bookmarkStart w:id="31" w:name="_Toc239281117"/>
+      <w:bookmarkStart w:id="30" w:name="_Toc239281117"/>
       <w:r>
         <w:t>Herramientas de aplicación</w:t>
       </w:r>
-      <w:bookmarkEnd w:id="31"/>
+      <w:bookmarkEnd w:id="30"/>
       <w:r>
         <w:t xml:space="preserve"> </w:t>
       </w:r>
@@ -5809,11 +5886,11 @@
       <w:r>
         <w:t xml:space="preserve"> </w:t>
       </w:r>
-      <w:bookmarkStart w:id="32" w:name="_Toc239281118"/>
+      <w:bookmarkStart w:id="31" w:name="_Toc239281118"/>
       <w:r>
         <w:t>Técnicas de aplicación</w:t>
       </w:r>
-      <w:bookmarkEnd w:id="32"/>
+      <w:bookmarkEnd w:id="31"/>
     </w:p>
     <w:p>
       <w:pPr>
@@ -5842,11 +5919,11 @@
       <w:r>
         <w:t xml:space="preserve"> </w:t>
       </w:r>
-      <w:bookmarkStart w:id="33" w:name="_Toc239281119"/>
+      <w:bookmarkStart w:id="32" w:name="_Toc239281119"/>
       <w:r>
         <w:t>Determinación del Universo y la Muestra</w:t>
       </w:r>
-      <w:bookmarkEnd w:id="33"/>
+      <w:bookmarkEnd w:id="32"/>
     </w:p>
     <w:p>
       <w:pPr>
@@ -5876,11 +5953,11 @@
       <w:r>
         <w:t xml:space="preserve"> </w:t>
       </w:r>
-      <w:bookmarkStart w:id="34" w:name="_Toc239281120"/>
+      <w:bookmarkStart w:id="33" w:name="_Toc239281120"/>
       <w:r>
         <w:t>Diseño de Herramienta</w:t>
       </w:r>
-      <w:bookmarkEnd w:id="34"/>
+      <w:bookmarkEnd w:id="33"/>
     </w:p>
     <w:p>
       <w:pPr>
@@ -5906,11 +5983,11 @@
           <w:numId w:val="23"/>
         </w:numPr>
       </w:pPr>
-      <w:bookmarkStart w:id="35" w:name="_Toc239281121"/>
+      <w:bookmarkStart w:id="34" w:name="_Toc239281121"/>
       <w:r>
         <w:t>Estudio de Mercado</w:t>
       </w:r>
-      <w:bookmarkEnd w:id="35"/>
+      <w:bookmarkEnd w:id="34"/>
     </w:p>
     <w:p>
       <w:pPr>
@@ -6113,7 +6190,7 @@
         </w:rPr>
         <w:t xml:space="preserve"> </w:t>
       </w:r>
-      <w:bookmarkStart w:id="36" w:name="_Toc239281122"/>
+      <w:bookmarkStart w:id="35" w:name="_Toc239281122"/>
       <w:r>
         <w:rPr>
           <w:rFonts w:cs="Times New Roman"/>
@@ -6121,7 +6198,7 @@
         </w:rPr>
         <w:t>Aplicación de Herramientas de Investigación</w:t>
       </w:r>
-      <w:bookmarkEnd w:id="36"/>
+      <w:bookmarkEnd w:id="35"/>
     </w:p>
     <w:p>
       <w:pPr>
@@ -6151,11 +6228,11 @@
         <w:lastRenderedPageBreak/>
         <w:t xml:space="preserve"> </w:t>
       </w:r>
-      <w:bookmarkStart w:id="37" w:name="_Toc239281123"/>
+      <w:bookmarkStart w:id="36" w:name="_Toc239281123"/>
       <w:r>
         <w:t>Análisis de resultados</w:t>
       </w:r>
-      <w:bookmarkEnd w:id="37"/>
+      <w:bookmarkEnd w:id="36"/>
     </w:p>
     <w:p>
       <w:pPr>
@@ -6181,11 +6258,11 @@
           <w:numId w:val="23"/>
         </w:numPr>
       </w:pPr>
-      <w:bookmarkStart w:id="38" w:name="_Toc239281124"/>
+      <w:bookmarkStart w:id="37" w:name="_Toc239281124"/>
       <w:r>
         <w:t>Análisis de Mercado</w:t>
       </w:r>
-      <w:bookmarkEnd w:id="38"/>
+      <w:bookmarkEnd w:id="37"/>
     </w:p>
     <w:p>
       <w:pPr>
@@ -7294,11 +7371,64 @@
           <w:numId w:val="23"/>
         </w:numPr>
       </w:pPr>
-      <w:bookmarkStart w:id="39" w:name="_Toc239281125"/>
+      <w:bookmarkStart w:id="38" w:name="_Toc239281125"/>
       <w:r>
         <w:lastRenderedPageBreak/>
         <w:t>Propuesta de Acción</w:t>
       </w:r>
+      <w:bookmarkEnd w:id="38"/>
+    </w:p>
+    <w:p>
+      <w:pPr>
+        <w:pStyle w:val="Texto"/>
+      </w:pPr>
+      <w:r>
+        <w:t xml:space="preserve">La propuesta de acción de esta investigación es SINKA, una plataforma web de concentración colaborativa que conecta de forma aleatoria a dos personas que desean enfocarse al mismo tiempo. Ambas comparten un temporizador </w:t>
+      </w:r>
+      <w:proofErr w:type="spellStart"/>
+      <w:r>
+        <w:t>Pomodoro</w:t>
+      </w:r>
+      <w:proofErr w:type="spellEnd"/>
+      <w:r>
+        <w:t xml:space="preserve"> sincronizado, pueden verse por cámara mientras trabajan y conversar únicamente durante los descansos. La constancia se premia con puntos de experiencia, monedas virtuales llamadas </w:t>
+      </w:r>
+      <w:proofErr w:type="spellStart"/>
+      <w:r>
+        <w:t>FocusCoins</w:t>
+      </w:r>
+      <w:proofErr w:type="spellEnd"/>
+      <w:r>
+        <w:t xml:space="preserve"> y rachas diarias que alimentan un ranking global. El nombre del producto nace de la idea de sincronizar el enfoque de dos personas que no se </w:t>
+      </w:r>
+      <w:proofErr w:type="gramStart"/>
+      <w:r>
+        <w:t>conocen</w:t>
+      </w:r>
+      <w:proofErr w:type="gramEnd"/>
+      <w:r>
+        <w:t xml:space="preserve"> pero comparten el mismo objetivo.</w:t>
+      </w:r>
+    </w:p>
+    <w:p>
+      <w:pPr>
+        <w:pStyle w:val="Texto"/>
+      </w:pPr>
+      <w:r>
+        <w:t>El desarrollo siguió la metodología híbrida descrita en el diseño metodológico. Las tres fases del proceso se documentan a continuación: el Pre-Juego con la planificación del producto, el Juego con la construcción iterativa del software y el Post-Juego con la liberación de la versión final.</w:t>
+      </w:r>
+    </w:p>
+    <w:p>
+      <w:pPr>
+        <w:pStyle w:val="Ttulo2"/>
+      </w:pPr>
+      <w:bookmarkStart w:id="39" w:name="_Toc239281126"/>
+      <w:r>
+        <w:t xml:space="preserve">10.1 </w:t>
+      </w:r>
+      <w:r>
+        <w:t>Fase 1: Pre-Juego</w:t>
+      </w:r>
       <w:bookmarkEnd w:id="39"/>
     </w:p>
     <w:p>
@@ -7306,99 +7436,46 @@
         <w:pStyle w:val="Texto"/>
       </w:pPr>
       <w:r>
-        <w:t xml:space="preserve">La propuesta de acción de esta investigación es SINKA, una plataforma web de concentración colaborativa que conecta de forma aleatoria a dos personas que desean enfocarse al mismo tiempo. Ambas comparten un temporizador </w:t>
+        <w:t xml:space="preserve">Esta fase corresponde a la planificación del producto. Se definieron los roles del equipo, los requerimientos del sistema, las historias de usuario del </w:t>
       </w:r>
       <w:proofErr w:type="spellStart"/>
       <w:r>
-        <w:t>Pomodoro</w:t>
+        <w:t>Product</w:t>
       </w:r>
       <w:proofErr w:type="spellEnd"/>
       <w:r>
-        <w:t xml:space="preserve"> sincronizado, pueden verse por cámara mientras trabajan y conversar únicamente durante los descansos. La constancia se premia con puntos de experiencia, monedas virtuales llamadas </w:t>
+        <w:t xml:space="preserve"> Backlog y la distribución del trabajo en </w:t>
       </w:r>
       <w:proofErr w:type="spellStart"/>
       <w:r>
-        <w:t>FocusCoins</w:t>
+        <w:t>sprints</w:t>
       </w:r>
       <w:proofErr w:type="spellEnd"/>
       <w:r>
-        <w:t xml:space="preserve"> y rachas diarias que alimentan un ranking global. El nombre del producto nace de la idea de sincronizar el enfoque de dos personas que no se </w:t>
-      </w:r>
-      <w:proofErr w:type="gramStart"/>
-      <w:r>
-        <w:t>conocen</w:t>
-      </w:r>
-      <w:proofErr w:type="gramEnd"/>
-      <w:r>
-        <w:t xml:space="preserve"> pero comparten el mismo objetivo.</w:t>
-      </w:r>
-    </w:p>
-    <w:p>
-      <w:pPr>
-        <w:pStyle w:val="Texto"/>
-      </w:pPr>
-      <w:r>
-        <w:t>El desarrollo siguió la metodología híbrida descrita en el diseño metodológico. Las tres fases del proceso se documentan a continuación: el Pre-Juego con la planificación del producto, el Juego con la construcción iterativa del software y el Post-Juego con la liberación de la versión final.</w:t>
-      </w:r>
-    </w:p>
-    <w:p>
-      <w:pPr>
-        <w:pStyle w:val="Ttulo2"/>
-      </w:pPr>
-      <w:bookmarkStart w:id="40" w:name="_Toc239281126"/>
-      <w:r>
-        <w:t xml:space="preserve">10.1 </w:t>
-      </w:r>
-      <w:r>
-        <w:t>Fase 1: Pre-Juego</w:t>
+        <w:t>.</w:t>
+      </w:r>
+    </w:p>
+    <w:p>
+      <w:pPr>
+        <w:pStyle w:val="TItulo3"/>
+        <w:rPr>
+          <w:lang w:val="en-US"/>
+        </w:rPr>
+      </w:pPr>
+      <w:bookmarkStart w:id="40" w:name="_Toc239281127"/>
+      <w:r>
+        <w:rPr>
+          <w:lang w:val="en-US"/>
+        </w:rPr>
+        <w:t xml:space="preserve">10.1.1 </w:t>
+      </w:r>
+      <w:r>
+        <w:rPr>
+          <w:lang w:val="en-US"/>
+        </w:rPr>
+        <w:t>Roles y Stakeholders</w:t>
       </w:r>
       <w:bookmarkEnd w:id="40"/>
-    </w:p>
-    <w:p>
-      <w:pPr>
-        <w:pStyle w:val="Texto"/>
-      </w:pPr>
-      <w:r>
-        <w:t xml:space="preserve">Esta fase corresponde a la planificación del producto. Se definieron los roles del equipo, los requerimientos del sistema, las historias de usuario del </w:t>
-      </w:r>
-      <w:proofErr w:type="spellStart"/>
-      <w:r>
-        <w:t>Product</w:t>
-      </w:r>
-      <w:proofErr w:type="spellEnd"/>
-      <w:r>
-        <w:t xml:space="preserve"> Backlog y la distribución del trabajo en </w:t>
-      </w:r>
-      <w:proofErr w:type="spellStart"/>
-      <w:r>
-        <w:t>sprints</w:t>
-      </w:r>
-      <w:proofErr w:type="spellEnd"/>
-      <w:r>
-        <w:t>.</w:t>
-      </w:r>
-    </w:p>
-    <w:p>
-      <w:pPr>
-        <w:pStyle w:val="TItulo3"/>
-        <w:rPr>
-          <w:lang w:val="en-US"/>
-        </w:rPr>
-      </w:pPr>
-      <w:bookmarkStart w:id="41" w:name="_Toc239281127"/>
-      <w:r>
-        <w:rPr>
-          <w:lang w:val="en-US"/>
-        </w:rPr>
-        <w:t xml:space="preserve">10.1.1 </w:t>
-      </w:r>
-      <w:r>
-        <w:rPr>
-          <w:lang w:val="en-US"/>
-        </w:rPr>
-        <w:t>Roles y Stakeholders</w:t>
-      </w:r>
-      <w:bookmarkEnd w:id="41"/>
     </w:p>
     <w:p>
       <w:pPr>
@@ -7486,14 +7563,14 @@
       <w:pPr>
         <w:pStyle w:val="TItulo3"/>
       </w:pPr>
-      <w:bookmarkStart w:id="42" w:name="_Toc239281128"/>
+      <w:bookmarkStart w:id="41" w:name="_Toc239281128"/>
       <w:r>
         <w:t xml:space="preserve">10.1.2 </w:t>
       </w:r>
       <w:r>
         <w:t>Requerimientos Funcionales y No Funcionales</w:t>
       </w:r>
-      <w:bookmarkEnd w:id="42"/>
+      <w:bookmarkEnd w:id="41"/>
     </w:p>
     <w:p>
       <w:pPr>
@@ -9531,14 +9608,14 @@
       <w:pPr>
         <w:pStyle w:val="TItulo3"/>
       </w:pPr>
-      <w:bookmarkStart w:id="43" w:name="_Toc239281129"/>
+      <w:bookmarkStart w:id="42" w:name="_Toc239281129"/>
       <w:r>
         <w:t xml:space="preserve">10.1.3 </w:t>
       </w:r>
       <w:r>
         <w:t>Historias de Usuario</w:t>
       </w:r>
-      <w:bookmarkEnd w:id="43"/>
+      <w:bookmarkEnd w:id="42"/>
     </w:p>
     <w:p>
       <w:pPr>
@@ -10392,7 +10469,7 @@
       <w:pPr>
         <w:pStyle w:val="TItulo3"/>
       </w:pPr>
-      <w:bookmarkStart w:id="44" w:name="_Toc239281130"/>
+      <w:bookmarkStart w:id="43" w:name="_Toc239281130"/>
       <w:r>
         <w:lastRenderedPageBreak/>
         <w:t xml:space="preserve">10.1.4 </w:t>
@@ -10400,7 +10477,7 @@
       <w:r>
         <w:t>Vista de Escenarios</w:t>
       </w:r>
-      <w:bookmarkEnd w:id="44"/>
+      <w:bookmarkEnd w:id="43"/>
     </w:p>
     <w:p>
       <w:pPr>
@@ -10503,7 +10580,7 @@
       <w:pPr>
         <w:pStyle w:val="TItulo3"/>
       </w:pPr>
-      <w:bookmarkStart w:id="45" w:name="_Toc239281131"/>
+      <w:bookmarkStart w:id="44" w:name="_Toc239281131"/>
       <w:r>
         <w:lastRenderedPageBreak/>
         <w:t xml:space="preserve">10.1.5 </w:t>
@@ -10515,7 +10592,7 @@
       <w:r>
         <w:t>Planning</w:t>
       </w:r>
-      <w:bookmarkEnd w:id="45"/>
+      <w:bookmarkEnd w:id="44"/>
       <w:proofErr w:type="spellEnd"/>
     </w:p>
     <w:p>
@@ -11346,43 +11423,43 @@
       <w:pPr>
         <w:pStyle w:val="Ttulo2"/>
       </w:pPr>
-      <w:bookmarkStart w:id="46" w:name="_Toc239281132"/>
+      <w:bookmarkStart w:id="45" w:name="_Toc239281132"/>
       <w:r>
         <w:t xml:space="preserve">10.2 </w:t>
       </w:r>
       <w:r>
         <w:t>Fase 2: Juego</w:t>
       </w:r>
+      <w:bookmarkEnd w:id="45"/>
+    </w:p>
+    <w:p>
+      <w:pPr>
+        <w:pStyle w:val="Texto"/>
+      </w:pPr>
+      <w:r>
+        <w:t xml:space="preserve">El Juego es la fase central del desarrollo. Durante doce semanas se construyó el software en incrementos funcionales siguiendo el plan de </w:t>
+      </w:r>
+      <w:proofErr w:type="spellStart"/>
+      <w:r>
+        <w:t>sprints</w:t>
+      </w:r>
+      <w:proofErr w:type="spellEnd"/>
+      <w:r>
+        <w:t xml:space="preserve"> definido en el Pre-Juego. En este apartado se documenta la arquitectura del sistema desde sus distintas vistas junto con la codificación y el plan de pruebas.</w:t>
+      </w:r>
+    </w:p>
+    <w:p>
+      <w:pPr>
+        <w:pStyle w:val="TItulo3"/>
+      </w:pPr>
+      <w:bookmarkStart w:id="46" w:name="_Toc239281133"/>
+      <w:r>
+        <w:t xml:space="preserve">10.2.1 </w:t>
+      </w:r>
+      <w:r>
+        <w:t>Vista Lógica</w:t>
+      </w:r>
       <w:bookmarkEnd w:id="46"/>
-    </w:p>
-    <w:p>
-      <w:pPr>
-        <w:pStyle w:val="Texto"/>
-      </w:pPr>
-      <w:r>
-        <w:t xml:space="preserve">El Juego es la fase central del desarrollo. Durante doce semanas se construyó el software en incrementos funcionales siguiendo el plan de </w:t>
-      </w:r>
-      <w:proofErr w:type="spellStart"/>
-      <w:r>
-        <w:t>sprints</w:t>
-      </w:r>
-      <w:proofErr w:type="spellEnd"/>
-      <w:r>
-        <w:t xml:space="preserve"> definido en el Pre-Juego. En este apartado se documenta la arquitectura del sistema desde sus distintas vistas junto con la codificación y el plan de pruebas.</w:t>
-      </w:r>
-    </w:p>
-    <w:p>
-      <w:pPr>
-        <w:pStyle w:val="TItulo3"/>
-      </w:pPr>
-      <w:bookmarkStart w:id="47" w:name="_Toc239281133"/>
-      <w:r>
-        <w:t xml:space="preserve">10.2.1 </w:t>
-      </w:r>
-      <w:r>
-        <w:t>Vista Lógica</w:t>
-      </w:r>
-      <w:bookmarkEnd w:id="47"/>
     </w:p>
     <w:p>
       <w:pPr>
@@ -11591,14 +11668,14 @@
       <w:pPr>
         <w:pStyle w:val="TItulo3"/>
       </w:pPr>
-      <w:bookmarkStart w:id="48" w:name="_Toc239281134"/>
+      <w:bookmarkStart w:id="47" w:name="_Toc239281134"/>
       <w:r>
         <w:t xml:space="preserve">10.2.2 </w:t>
       </w:r>
       <w:r>
         <w:t>Vista de Desarrollo</w:t>
       </w:r>
-      <w:bookmarkEnd w:id="48"/>
+      <w:bookmarkEnd w:id="47"/>
     </w:p>
     <w:p>
       <w:pPr>
@@ -12087,14 +12164,14 @@
       <w:pPr>
         <w:pStyle w:val="TItulo3"/>
       </w:pPr>
-      <w:bookmarkStart w:id="49" w:name="_Toc239281135"/>
+      <w:bookmarkStart w:id="48" w:name="_Toc239281135"/>
       <w:r>
         <w:t xml:space="preserve">10.2.3 </w:t>
       </w:r>
       <w:r>
         <w:t>Vista Física</w:t>
       </w:r>
-      <w:bookmarkEnd w:id="49"/>
+      <w:bookmarkEnd w:id="48"/>
     </w:p>
     <w:p>
       <w:pPr>
@@ -12242,14 +12319,14 @@
       <w:pPr>
         <w:pStyle w:val="TItulo3"/>
       </w:pPr>
-      <w:bookmarkStart w:id="50" w:name="_Toc239281136"/>
+      <w:bookmarkStart w:id="49" w:name="_Toc239281136"/>
       <w:r>
         <w:t xml:space="preserve">10.2.4 </w:t>
       </w:r>
       <w:r>
         <w:t>Codificación</w:t>
       </w:r>
-      <w:bookmarkEnd w:id="50"/>
+      <w:bookmarkEnd w:id="49"/>
     </w:p>
     <w:p>
       <w:pPr>
@@ -13653,12 +13730,12 @@
       <w:pPr>
         <w:pStyle w:val="TItulo3"/>
       </w:pPr>
-      <w:bookmarkStart w:id="51" w:name="_Toc239281137"/>
+      <w:bookmarkStart w:id="50" w:name="_Toc239281137"/>
       <w:r>
         <w:lastRenderedPageBreak/>
         <w:t>10.2.5 Pruebas</w:t>
       </w:r>
-      <w:bookmarkEnd w:id="51"/>
+      <w:bookmarkEnd w:id="50"/>
     </w:p>
     <w:p>
       <w:pPr>
@@ -14638,14 +14715,14 @@
       <w:pPr>
         <w:pStyle w:val="Ttulo2"/>
       </w:pPr>
-      <w:bookmarkStart w:id="52" w:name="_Toc239281138"/>
+      <w:bookmarkStart w:id="51" w:name="_Toc239281138"/>
       <w:r>
         <w:t xml:space="preserve">10.3 </w:t>
       </w:r>
       <w:r>
         <w:t>Fase 3: Post-Juego</w:t>
       </w:r>
-      <w:bookmarkEnd w:id="52"/>
+      <w:bookmarkEnd w:id="51"/>
     </w:p>
     <w:p>
       <w:pPr>
@@ -14659,7 +14736,7 @@
       <w:pPr>
         <w:pStyle w:val="TItulo3"/>
       </w:pPr>
-      <w:bookmarkStart w:id="53" w:name="_Toc239281139"/>
+      <w:bookmarkStart w:id="52" w:name="_Toc239281139"/>
       <w:r>
         <w:lastRenderedPageBreak/>
         <w:t xml:space="preserve">10.3.1 </w:t>
@@ -14667,124 +14744,124 @@
       <w:r>
         <w:t>Despliegue</w:t>
       </w:r>
+      <w:bookmarkEnd w:id="52"/>
+    </w:p>
+    <w:p>
+      <w:pPr>
+        <w:pStyle w:val="Texto"/>
+      </w:pPr>
+      <w:r>
+        <w:t>El despliegue transitó del entorno de desarrollo a los servicios en la nube descritos en la vista física. El proceso siguió estos pasos:</w:t>
+      </w:r>
+    </w:p>
+    <w:p>
+      <w:pPr>
+        <w:pStyle w:val="Texto"/>
+      </w:pPr>
+      <w:r>
+        <w:t xml:space="preserve">1. Configuración del backend en </w:t>
+      </w:r>
+      <w:proofErr w:type="spellStart"/>
+      <w:r>
+        <w:t>Railway</w:t>
+      </w:r>
+      <w:proofErr w:type="spellEnd"/>
+      <w:r>
+        <w:t xml:space="preserve"> conectado al repositorio de GitHub, con despliegue automático en cada </w:t>
+      </w:r>
+      <w:proofErr w:type="spellStart"/>
+      <w:r>
+        <w:t>push</w:t>
+      </w:r>
+      <w:proofErr w:type="spellEnd"/>
+      <w:r>
+        <w:t xml:space="preserve"> a la rama principal.</w:t>
+      </w:r>
+    </w:p>
+    <w:p>
+      <w:pPr>
+        <w:pStyle w:val="Texto"/>
+      </w:pPr>
+      <w:r>
+        <w:t>2. Definición de las variables de entorno con las credenciales de la base de datos, de Redis y las claves de la aplicación.</w:t>
+      </w:r>
+    </w:p>
+    <w:p>
+      <w:pPr>
+        <w:pStyle w:val="Texto"/>
+      </w:pPr>
+      <w:r>
+        <w:t xml:space="preserve">3. Aplicación de las migraciones de </w:t>
+      </w:r>
+      <w:proofErr w:type="spellStart"/>
+      <w:r>
+        <w:t>Alembic</w:t>
+      </w:r>
+      <w:proofErr w:type="spellEnd"/>
+      <w:r>
+        <w:t xml:space="preserve"> sobre la base de datos PostgreSQL de </w:t>
+      </w:r>
+      <w:proofErr w:type="spellStart"/>
+      <w:r>
+        <w:t>Neon</w:t>
+      </w:r>
+      <w:proofErr w:type="spellEnd"/>
+      <w:r>
+        <w:t xml:space="preserve"> para crear las tablas del sistema.</w:t>
+      </w:r>
+    </w:p>
+    <w:p>
+      <w:pPr>
+        <w:pStyle w:val="Texto"/>
+      </w:pPr>
+      <w:r>
+        <w:t xml:space="preserve">4. Configuración del frontend en </w:t>
+      </w:r>
+      <w:proofErr w:type="spellStart"/>
+      <w:r>
+        <w:t>Vercel</w:t>
+      </w:r>
+      <w:proofErr w:type="spellEnd"/>
+      <w:r>
+        <w:t xml:space="preserve"> apuntando a la URL pública del backend, también con despliegue automático desde la rama principal.</w:t>
+      </w:r>
+    </w:p>
+    <w:p>
+      <w:pPr>
+        <w:pStyle w:val="Texto"/>
+      </w:pPr>
+      <w:r>
+        <w:t xml:space="preserve">5. Registro de los servidores STUN y TURN necesarios para que </w:t>
+      </w:r>
+      <w:proofErr w:type="spellStart"/>
+      <w:r>
+        <w:t>WebRTC</w:t>
+      </w:r>
+      <w:proofErr w:type="spellEnd"/>
+      <w:r>
+        <w:t xml:space="preserve"> funcione en redes restringidas.</w:t>
+      </w:r>
+    </w:p>
+    <w:p>
+      <w:pPr>
+        <w:pStyle w:val="Texto"/>
+      </w:pPr>
+      <w:r>
+        <w:t>6. Verificación del flujo completo en producción con dos cuentas reales desde navegadores distintos.</w:t>
+      </w:r>
+    </w:p>
+    <w:p>
+      <w:pPr>
+        <w:pStyle w:val="TItulo3"/>
+      </w:pPr>
+      <w:bookmarkStart w:id="53" w:name="_Toc239281140"/>
+      <w:r>
+        <w:t xml:space="preserve">10.3.2 </w:t>
+      </w:r>
+      <w:r>
+        <w:t>Verificación del Sistema</w:t>
+      </w:r>
       <w:bookmarkEnd w:id="53"/>
-    </w:p>
-    <w:p>
-      <w:pPr>
-        <w:pStyle w:val="Texto"/>
-      </w:pPr>
-      <w:r>
-        <w:t>El despliegue transitó del entorno de desarrollo a los servicios en la nube descritos en la vista física. El proceso siguió estos pasos:</w:t>
-      </w:r>
-    </w:p>
-    <w:p>
-      <w:pPr>
-        <w:pStyle w:val="Texto"/>
-      </w:pPr>
-      <w:r>
-        <w:t xml:space="preserve">1. Configuración del backend en </w:t>
-      </w:r>
-      <w:proofErr w:type="spellStart"/>
-      <w:r>
-        <w:t>Railway</w:t>
-      </w:r>
-      <w:proofErr w:type="spellEnd"/>
-      <w:r>
-        <w:t xml:space="preserve"> conectado al repositorio de GitHub, con despliegue automático en cada </w:t>
-      </w:r>
-      <w:proofErr w:type="spellStart"/>
-      <w:r>
-        <w:t>push</w:t>
-      </w:r>
-      <w:proofErr w:type="spellEnd"/>
-      <w:r>
-        <w:t xml:space="preserve"> a la rama principal.</w:t>
-      </w:r>
-    </w:p>
-    <w:p>
-      <w:pPr>
-        <w:pStyle w:val="Texto"/>
-      </w:pPr>
-      <w:r>
-        <w:t>2. Definición de las variables de entorno con las credenciales de la base de datos, de Redis y las claves de la aplicación.</w:t>
-      </w:r>
-    </w:p>
-    <w:p>
-      <w:pPr>
-        <w:pStyle w:val="Texto"/>
-      </w:pPr>
-      <w:r>
-        <w:t xml:space="preserve">3. Aplicación de las migraciones de </w:t>
-      </w:r>
-      <w:proofErr w:type="spellStart"/>
-      <w:r>
-        <w:t>Alembic</w:t>
-      </w:r>
-      <w:proofErr w:type="spellEnd"/>
-      <w:r>
-        <w:t xml:space="preserve"> sobre la base de datos PostgreSQL de </w:t>
-      </w:r>
-      <w:proofErr w:type="spellStart"/>
-      <w:r>
-        <w:t>Neon</w:t>
-      </w:r>
-      <w:proofErr w:type="spellEnd"/>
-      <w:r>
-        <w:t xml:space="preserve"> para crear las tablas del sistema.</w:t>
-      </w:r>
-    </w:p>
-    <w:p>
-      <w:pPr>
-        <w:pStyle w:val="Texto"/>
-      </w:pPr>
-      <w:r>
-        <w:t xml:space="preserve">4. Configuración del frontend en </w:t>
-      </w:r>
-      <w:proofErr w:type="spellStart"/>
-      <w:r>
-        <w:t>Vercel</w:t>
-      </w:r>
-      <w:proofErr w:type="spellEnd"/>
-      <w:r>
-        <w:t xml:space="preserve"> apuntando a la URL pública del backend, también con despliegue automático desde la rama principal.</w:t>
-      </w:r>
-    </w:p>
-    <w:p>
-      <w:pPr>
-        <w:pStyle w:val="Texto"/>
-      </w:pPr>
-      <w:r>
-        <w:t xml:space="preserve">5. Registro de los servidores STUN y TURN necesarios para que </w:t>
-      </w:r>
-      <w:proofErr w:type="spellStart"/>
-      <w:r>
-        <w:t>WebRTC</w:t>
-      </w:r>
-      <w:proofErr w:type="spellEnd"/>
-      <w:r>
-        <w:t xml:space="preserve"> funcione en redes restringidas.</w:t>
-      </w:r>
-    </w:p>
-    <w:p>
-      <w:pPr>
-        <w:pStyle w:val="Texto"/>
-      </w:pPr>
-      <w:r>
-        <w:t>6. Verificación del flujo completo en producción con dos cuentas reales desde navegadores distintos.</w:t>
-      </w:r>
-    </w:p>
-    <w:p>
-      <w:pPr>
-        <w:pStyle w:val="TItulo3"/>
-      </w:pPr>
-      <w:bookmarkStart w:id="54" w:name="_Toc239281140"/>
-      <w:r>
-        <w:t xml:space="preserve">10.3.2 </w:t>
-      </w:r>
-      <w:r>
-        <w:t>Verificación del Sistema</w:t>
-      </w:r>
-      <w:bookmarkEnd w:id="54"/>
     </w:p>
     <w:p>
       <w:pPr>
@@ -14818,14 +14895,14 @@
       <w:pPr>
         <w:pStyle w:val="TItulo3"/>
       </w:pPr>
-      <w:bookmarkStart w:id="55" w:name="_Toc239281141"/>
+      <w:bookmarkStart w:id="54" w:name="_Toc239281141"/>
       <w:r>
         <w:t xml:space="preserve">10.3.3 </w:t>
       </w:r>
       <w:r>
         <w:t>Revisión de Pruebas</w:t>
       </w:r>
-      <w:bookmarkEnd w:id="55"/>
+      <w:bookmarkEnd w:id="54"/>
     </w:p>
     <w:p>
       <w:pPr>
@@ -16345,7 +16422,7 @@
           <w:docGrid w:linePitch="360"/>
         </w:sectPr>
       </w:pPr>
-      <w:bookmarkStart w:id="56" w:name="_Toc239281142"/>
+      <w:bookmarkStart w:id="55" w:name="_Toc239281142"/>
     </w:p>
     <w:p>
       <w:pPr>
@@ -16360,7 +16437,7 @@
         <w:lastRenderedPageBreak/>
         <w:t>Modelo de Emprendimiento</w:t>
       </w:r>
-      <w:bookmarkEnd w:id="56"/>
+      <w:bookmarkEnd w:id="55"/>
     </w:p>
     <w:p>
       <w:pPr>
@@ -16370,7 +16447,7 @@
           <w:numId w:val="23"/>
         </w:numPr>
       </w:pPr>
-      <w:bookmarkStart w:id="57" w:name="_Toc239281143"/>
+      <w:bookmarkStart w:id="56" w:name="_Toc239281143"/>
       <w:r>
         <w:t xml:space="preserve">Modelo </w:t>
       </w:r>
@@ -16380,7 +16457,7 @@
       <w:r>
         <w:t>S</w:t>
       </w:r>
-      <w:bookmarkEnd w:id="57"/>
+      <w:bookmarkEnd w:id="56"/>
     </w:p>
     <w:tbl>
       <w:tblPr>
@@ -17358,13 +17435,12 @@
         <w:pStyle w:val="Ttulo2"/>
         <w:ind w:left="720"/>
       </w:pPr>
-      <w:bookmarkStart w:id="58" w:name="_Toc239281144"/>
+      <w:bookmarkStart w:id="57" w:name="_Toc239281144"/>
     </w:p>
     <w:p/>
     <w:p>
       <w:pPr>
         <w:sectPr>
-          <w:type w:val="nextPage"/>
           <w:pgSz w:w="15840" w:h="12240" w:orient="landscape" w:code="1"/>
           <w:pgMar w:top="1440" w:right="1440" w:bottom="1440" w:left="1440" w:header="709" w:footer="709" w:gutter="0"/>
           <w:cols w:space="708"/>
@@ -17384,7 +17460,7 @@
       <w:r>
         <w:t>Descripción Empresarial</w:t>
       </w:r>
-      <w:bookmarkEnd w:id="58"/>
+      <w:bookmarkEnd w:id="57"/>
     </w:p>
     <w:p>
       <w:pPr>
@@ -17799,12 +17875,12 @@
           <w:numId w:val="23"/>
         </w:numPr>
       </w:pPr>
-      <w:bookmarkStart w:id="59" w:name="_Toc239281145"/>
+      <w:bookmarkStart w:id="58" w:name="_Toc239281145"/>
       <w:r>
         <w:lastRenderedPageBreak/>
         <w:t>Flujo Financiero Esperado</w:t>
       </w:r>
-      <w:bookmarkEnd w:id="59"/>
+      <w:bookmarkEnd w:id="58"/>
     </w:p>
     <w:p>
       <w:pPr>
@@ -23346,14 +23422,14 @@
           <w:numId w:val="23"/>
         </w:numPr>
       </w:pPr>
-      <w:bookmarkStart w:id="60" w:name="_Toc239281146"/>
+      <w:bookmarkStart w:id="59" w:name="_Toc239281146"/>
       <w:r>
         <w:t>Identidad</w:t>
       </w:r>
       <w:r>
         <w:t xml:space="preserve"> Visual</w:t>
       </w:r>
-      <w:bookmarkEnd w:id="60"/>
+      <w:bookmarkEnd w:id="59"/>
     </w:p>
     <w:p>
       <w:pPr>
@@ -23622,12 +23698,12 @@
           <w:numId w:val="23"/>
         </w:numPr>
       </w:pPr>
-      <w:bookmarkStart w:id="61" w:name="_Toc239281147"/>
+      <w:bookmarkStart w:id="60" w:name="_Toc239281147"/>
       <w:r>
         <w:lastRenderedPageBreak/>
         <w:t>Descripción de Producto o Servicio</w:t>
       </w:r>
-      <w:bookmarkEnd w:id="61"/>
+      <w:bookmarkEnd w:id="60"/>
     </w:p>
     <w:p>
       <w:pPr>
@@ -24103,11 +24179,11 @@
           <w:numId w:val="23"/>
         </w:numPr>
       </w:pPr>
-      <w:bookmarkStart w:id="62" w:name="_Toc239281148"/>
+      <w:bookmarkStart w:id="61" w:name="_Toc239281148"/>
       <w:r>
         <w:t>Validación</w:t>
       </w:r>
-      <w:bookmarkEnd w:id="62"/>
+      <w:bookmarkEnd w:id="61"/>
       <w:r>
         <w:t xml:space="preserve"> </w:t>
       </w:r>
@@ -24149,12 +24225,12 @@
           <w:numId w:val="23"/>
         </w:numPr>
       </w:pPr>
-      <w:bookmarkStart w:id="63" w:name="_Toc239281149"/>
+      <w:bookmarkStart w:id="62" w:name="_Toc239281149"/>
       <w:r>
         <w:lastRenderedPageBreak/>
         <w:t>Conclusiones</w:t>
       </w:r>
-      <w:bookmarkEnd w:id="63"/>
+      <w:bookmarkEnd w:id="62"/>
     </w:p>
     <w:p>
       <w:pPr>
@@ -24225,12 +24301,12 @@
           <w:numId w:val="23"/>
         </w:numPr>
       </w:pPr>
-      <w:bookmarkStart w:id="64" w:name="_Toc239281150"/>
+      <w:bookmarkStart w:id="63" w:name="_Toc239281150"/>
       <w:r>
         <w:lastRenderedPageBreak/>
         <w:t>Recomendaciones</w:t>
       </w:r>
-      <w:bookmarkEnd w:id="64"/>
+      <w:bookmarkEnd w:id="63"/>
     </w:p>
     <w:p>
       <w:pPr>
@@ -24290,16 +24366,16 @@
           <w:numId w:val="23"/>
         </w:numPr>
       </w:pPr>
-      <w:bookmarkStart w:id="65" w:name="_bookmark137"/>
-      <w:bookmarkStart w:id="66" w:name="_bookmark138"/>
-      <w:bookmarkStart w:id="67" w:name="_Toc239281151"/>
+      <w:bookmarkStart w:id="64" w:name="_bookmark137"/>
+      <w:bookmarkStart w:id="65" w:name="_bookmark138"/>
+      <w:bookmarkStart w:id="66" w:name="_Toc239281151"/>
+      <w:bookmarkEnd w:id="64"/>
       <w:bookmarkEnd w:id="65"/>
-      <w:bookmarkEnd w:id="66"/>
       <w:r>
         <w:lastRenderedPageBreak/>
         <w:t>Bibliografía</w:t>
       </w:r>
-      <w:bookmarkEnd w:id="67"/>
+      <w:bookmarkEnd w:id="66"/>
     </w:p>
     <w:p>
       <w:pPr>
@@ -24891,7 +24967,7 @@
         </w:numPr>
         <w:ind w:left="360" w:hanging="360"/>
       </w:pPr>
-      <w:bookmarkStart w:id="68" w:name="_Toc239281152"/>
+      <w:bookmarkStart w:id="67" w:name="_Toc239281152"/>
       <w:r>
         <w:lastRenderedPageBreak/>
         <w:t>1</w:t>
@@ -24905,13 +24981,13 @@
       <w:r>
         <w:t>Anexos</w:t>
       </w:r>
-      <w:bookmarkEnd w:id="68"/>
+      <w:bookmarkEnd w:id="67"/>
     </w:p>
     <w:p>
       <w:pPr>
         <w:pStyle w:val="Ttulo2"/>
       </w:pPr>
-      <w:bookmarkStart w:id="69" w:name="_Toc239281153"/>
+      <w:bookmarkStart w:id="68" w:name="_Toc239281153"/>
       <w:r>
         <w:rPr>
           <w:noProof/>
@@ -24985,7 +25061,7 @@
       <w:r>
         <w:t>a Valorada del Anteproyecto</w:t>
       </w:r>
-      <w:bookmarkEnd w:id="69"/>
+      <w:bookmarkEnd w:id="68"/>
     </w:p>
     <w:p>
       <w:pPr>
@@ -25258,7 +25334,7 @@
       <w:pPr>
         <w:pStyle w:val="Ttulo2"/>
       </w:pPr>
-      <w:bookmarkStart w:id="70" w:name="_Toc239281154"/>
+      <w:bookmarkStart w:id="69" w:name="_Toc239281154"/>
       <w:r>
         <w:lastRenderedPageBreak/>
         <w:t>1</w:t>
@@ -25279,30 +25355,30 @@
       <w:r>
         <w:t>Abstract</w:t>
       </w:r>
+      <w:bookmarkEnd w:id="69"/>
+      <w:proofErr w:type="spellEnd"/>
+    </w:p>
+    <w:p>
+      <w:pPr>
+        <w:pStyle w:val="Ttulo2"/>
+      </w:pPr>
+      <w:bookmarkStart w:id="70" w:name="_Toc239281155"/>
+      <w:r>
+        <w:t>1</w:t>
+      </w:r>
+      <w:r>
+        <w:t>5</w:t>
+      </w:r>
+      <w:r>
+        <w:t>.</w:t>
+      </w:r>
+      <w:r>
+        <w:t>3</w:t>
+      </w:r>
+      <w:r>
+        <w:t>. Presupuesto</w:t>
+      </w:r>
       <w:bookmarkEnd w:id="70"/>
-      <w:proofErr w:type="spellEnd"/>
-    </w:p>
-    <w:p>
-      <w:pPr>
-        <w:pStyle w:val="Ttulo2"/>
-      </w:pPr>
-      <w:bookmarkStart w:id="71" w:name="_Toc239281155"/>
-      <w:r>
-        <w:t>1</w:t>
-      </w:r>
-      <w:r>
-        <w:t>5</w:t>
-      </w:r>
-      <w:r>
-        <w:t>.</w:t>
-      </w:r>
-      <w:r>
-        <w:t>3</w:t>
-      </w:r>
-      <w:r>
-        <w:t>. Presupuesto</w:t>
-      </w:r>
-      <w:bookmarkEnd w:id="71"/>
       <w:r>
         <w:t xml:space="preserve"> </w:t>
       </w:r>
@@ -25311,7 +25387,7 @@
       <w:pPr>
         <w:pStyle w:val="Texto"/>
       </w:pPr>
-      <w:bookmarkStart w:id="72" w:name="_Toc180530952"/>
+      <w:bookmarkStart w:id="71" w:name="_Toc180530952"/>
       <w:r>
         <w:t>El presupuesto reúne los recursos que demandó el desarrollo de esta investigación durante los seis meses del proceso de titulación. La mayor parte corresponde al equipo de trabajo y a la conexión a internet, mientras que la infraestructura del software no representó costo alguno por operar sobre servicios en la nube con planes gratuitos.</w:t>
       </w:r>
@@ -25328,9 +25404,9 @@
           <w:szCs w:val="20"/>
         </w:rPr>
       </w:pPr>
-      <w:bookmarkStart w:id="73" w:name="_Toc219314920"/>
+      <w:bookmarkStart w:id="72" w:name="_Toc219314920"/>
+      <w:bookmarkEnd w:id="71"/>
       <w:bookmarkEnd w:id="72"/>
-      <w:bookmarkEnd w:id="73"/>
       <w:r>
         <w:rPr>
           <w:b/>
@@ -26752,7 +26828,7 @@
       <w:pPr>
         <w:pStyle w:val="Ttulo2"/>
       </w:pPr>
-      <w:bookmarkStart w:id="74" w:name="_Toc239281156"/>
+      <w:bookmarkStart w:id="73" w:name="_Toc239281156"/>
       <w:r>
         <w:lastRenderedPageBreak/>
         <w:t>1</w:t>
@@ -26769,7 +26845,7 @@
       <w:r>
         <w:t>. Cronograma</w:t>
       </w:r>
-      <w:bookmarkEnd w:id="74"/>
+      <w:bookmarkEnd w:id="73"/>
       <w:r>
         <w:t xml:space="preserve"> </w:t>
       </w:r>
@@ -26784,8 +26860,8 @@
           <w:szCs w:val="28"/>
         </w:rPr>
       </w:pPr>
-      <w:bookmarkStart w:id="75" w:name="_Toc219314921"/>
-      <w:bookmarkEnd w:id="75"/>
+      <w:bookmarkStart w:id="74" w:name="_Toc219314921"/>
+      <w:bookmarkEnd w:id="74"/>
       <w:r>
         <w:rPr>
           <w:b/>
@@ -45548,7 +45624,7 @@
           <w:lang w:val="es-US"/>
         </w:rPr>
       </w:pPr>
-      <w:bookmarkStart w:id="76" w:name="_Toc239281157"/>
+      <w:bookmarkStart w:id="75" w:name="_Toc239281157"/>
       <w:r>
         <w:rPr>
           <w:lang w:val="es-US"/>
@@ -45598,7 +45674,7 @@
         </w:rPr>
         <w:t>jecución</w:t>
       </w:r>
-      <w:bookmarkEnd w:id="76"/>
+      <w:bookmarkEnd w:id="75"/>
     </w:p>
     <w:p>
       <w:pPr>
@@ -45987,7 +46063,7 @@
           <w:rFonts w:eastAsia="Calibri"/>
         </w:rPr>
       </w:pPr>
-      <w:bookmarkStart w:id="77" w:name="_Toc239281158"/>
+      <w:bookmarkStart w:id="76" w:name="_Toc239281158"/>
       <w:r>
         <w:rPr>
           <w:rFonts w:eastAsia="Calibri"/>
@@ -46018,7 +46094,7 @@
         </w:rPr>
         <w:t>. Certificado de Implementación</w:t>
       </w:r>
-      <w:bookmarkEnd w:id="77"/>
+      <w:bookmarkEnd w:id="76"/>
     </w:p>
     <w:p>
       <w:pPr>
@@ -46518,7 +46594,7 @@
       <w:pPr>
         <w:pStyle w:val="Ttulo2"/>
       </w:pPr>
-      <w:bookmarkStart w:id="78" w:name="_Toc239281159"/>
+      <w:bookmarkStart w:id="77" w:name="_Toc239281159"/>
       <w:r>
         <w:lastRenderedPageBreak/>
         <w:t>1</w:t>
@@ -46529,7 +46605,7 @@
       <w:r>
         <w:t>.7. Modelo de Encuesta Aplicada</w:t>
       </w:r>
-      <w:bookmarkEnd w:id="78"/>
+      <w:bookmarkEnd w:id="77"/>
     </w:p>
     <w:p>
       <w:pPr>
@@ -48535,7 +48611,7 @@
       <w:pPr>
         <w:pStyle w:val="Ttulo2"/>
       </w:pPr>
-      <w:bookmarkStart w:id="79" w:name="_Toc239281160"/>
+      <w:bookmarkStart w:id="78" w:name="_Toc239281160"/>
       <w:r>
         <w:lastRenderedPageBreak/>
         <w:t>1</w:t>
@@ -48555,7 +48631,7 @@
       <w:r>
         <w:t xml:space="preserve"> Varias</w:t>
       </w:r>
-      <w:bookmarkEnd w:id="79"/>
+      <w:bookmarkEnd w:id="78"/>
     </w:p>
     <w:p>
       <w:pPr>

</xml_diff>